<commit_message>
Refine 3D portfolio hero and evidence gallery
</commit_message>
<xml_diff>
--- a/public/assets/resume/Joel_Laggui_Resume_ATS_2026.docx
+++ b/public/assets/resume/Joel_Laggui_Resume_ATS_2026.docx
@@ -11,40 +11,10 @@
         <w:rPr>
           <w:rFonts w:ascii="Arial" w:hAnsi="Arial" w:eastAsia="Arial"/>
           <w:b/>
-          <w:color w:val="111827"/>
-          <w:sz w:val="34"/>
+          <w:color w:val="111111"/>
+          <w:sz w:val="41"/>
         </w:rPr>
         <w:t>JOEL LAGGUI JR.</w:t>
-      </w:r>
-    </w:p>
-    <w:p>
-      <w:pPr>
-        <w:spacing w:after="20"/>
-        <w:jc w:val="center"/>
-      </w:pPr>
-      <w:r>
-        <w:rPr>
-          <w:rFonts w:ascii="Arial" w:hAnsi="Arial" w:eastAsia="Arial"/>
-          <w:b/>
-          <w:color w:val="0B5CAD"/>
-          <w:sz w:val="20"/>
-        </w:rPr>
-        <w:t>FULL-STACK DEVELOPER | AI AUTOMATION BUILDER</w:t>
-      </w:r>
-    </w:p>
-    <w:p>
-      <w:pPr>
-        <w:spacing w:after="10"/>
-        <w:jc w:val="center"/>
-      </w:pPr>
-      <w:r>
-        <w:rPr>
-          <w:rFonts w:ascii="Arial" w:hAnsi="Arial" w:eastAsia="Arial"/>
-          <w:b w:val="0"/>
-          <w:color w:val="1F2328"/>
-          <w:sz w:val="17"/>
-        </w:rPr>
-        <w:t>Santa Maria, Isabela, Philippines | +63 915 368 3496 | jlaggui47@gmail.com</w:t>
       </w:r>
     </w:p>
     <w:p>
@@ -52,10 +22,40 @@
         <w:spacing w:after="40"/>
         <w:jc w:val="center"/>
       </w:pPr>
+      <w:r>
+        <w:rPr>
+          <w:rFonts w:ascii="Arial" w:hAnsi="Arial" w:eastAsia="Arial"/>
+          <w:b/>
+          <w:color w:val="111111"/>
+          <w:sz w:val="22"/>
+        </w:rPr>
+        <w:t>FULL-STACK DEVELOPER | AI AUTOMATION BUILDER</w:t>
+      </w:r>
+    </w:p>
+    <w:p>
+      <w:pPr>
+        <w:spacing w:after="24"/>
+        <w:jc w:val="center"/>
+      </w:pPr>
+      <w:r>
+        <w:rPr>
+          <w:rFonts w:ascii="Arial" w:hAnsi="Arial" w:eastAsia="Arial"/>
+          <w:b w:val="0"/>
+          <w:color w:val="111111"/>
+          <w:sz w:val="19"/>
+        </w:rPr>
+        <w:t>Santa Maria, Isabela, Philippines | +63 915 368 3496 | jlaggui47@gmail.com</w:t>
+      </w:r>
+    </w:p>
+    <w:p>
+      <w:pPr>
+        <w:spacing w:after="60"/>
+        <w:jc w:val="center"/>
+      </w:pPr>
       <w:hyperlink r:id="rId9">
         <w:r>
           <w:rPr>
-            <w:color w:val="0563C1"/>
+            <w:color w:val="111111"/>
             <w:u w:val="single"/>
           </w:rPr>
           <w:t>Portfolio</w:t>
@@ -65,15 +65,15 @@
         <w:rPr>
           <w:rFonts w:ascii="Arial" w:hAnsi="Arial" w:eastAsia="Arial"/>
           <w:b w:val="0"/>
-          <w:color w:val="1F2328"/>
-          <w:sz w:val="17"/>
+          <w:color w:val="111111"/>
+          <w:sz w:val="19"/>
         </w:rPr>
         <w:t xml:space="preserve"> | </w:t>
       </w:r>
       <w:hyperlink r:id="rId10">
         <w:r>
           <w:rPr>
-            <w:color w:val="0563C1"/>
+            <w:color w:val="111111"/>
             <w:u w:val="single"/>
           </w:rPr>
           <w:t>GitHub</w:t>
@@ -83,15 +83,15 @@
         <w:rPr>
           <w:rFonts w:ascii="Arial" w:hAnsi="Arial" w:eastAsia="Arial"/>
           <w:b w:val="0"/>
-          <w:color w:val="1F2328"/>
-          <w:sz w:val="17"/>
+          <w:color w:val="111111"/>
+          <w:sz w:val="19"/>
         </w:rPr>
         <w:t xml:space="preserve"> | </w:t>
       </w:r>
       <w:hyperlink r:id="rId11">
         <w:r>
           <w:rPr>
-            <w:color w:val="0563C1"/>
+            <w:color w:val="111111"/>
             <w:u w:val="single"/>
           </w:rPr>
           <w:t>LinkedIn</w:t>
@@ -103,31 +103,31 @@
         <w:pStyle w:val="ResumeSection"/>
         <w:keepNext/>
         <w:pBdr>
-          <w:bottom w:val="single" w:sz="6" w:space="2" w:color="B8C4CE"/>
+          <w:bottom w:val="single" w:sz="6" w:space="2" w:color="A7A7A7"/>
         </w:pBdr>
       </w:pPr>
       <w:r>
         <w:rPr>
           <w:rFonts w:ascii="Arial" w:hAnsi="Arial" w:eastAsia="Arial"/>
           <w:b/>
-          <w:color w:val="0B5CAD"/>
-          <w:sz w:val="19"/>
+          <w:color w:val="111111"/>
+          <w:sz w:val="22"/>
         </w:rPr>
         <w:t>PROFESSIONAL SUMMARY</w:t>
       </w:r>
     </w:p>
     <w:p>
       <w:pPr>
-        <w:spacing w:after="24" w:line="240" w:lineRule="auto"/>
+        <w:spacing w:after="48" w:line="259" w:lineRule="auto"/>
       </w:pPr>
       <w:r>
         <w:rPr>
           <w:rFonts w:ascii="Arial" w:hAnsi="Arial" w:eastAsia="Arial"/>
           <w:b w:val="0"/>
-          <w:color w:val="1F2328"/>
-          <w:sz w:val="19"/>
+          <w:color w:val="111111"/>
+          <w:sz w:val="21"/>
         </w:rPr>
-        <w:t>Full-stack developer and AI automation builder with 2+ years of hands-on experience delivering responsive websites, business systems, data workflows, and applied AI prototypes. Builds projects end to end—from requirements and architecture to testing, deployment, troubleshooting, and clear client handoff.</w:t>
+        <w:t>Full-stack developer and AI automation builder with 3 years of hands-on experience delivering responsive websites, business systems, data workflows, and applied AI prototypes. Builds projects end to end, from requirements and architecture to testing, deployment, troubleshooting, and clear client handoff.</w:t>
       </w:r>
     </w:p>
     <w:p>
@@ -135,29 +135,29 @@
         <w:pStyle w:val="ResumeSection"/>
         <w:keepNext/>
         <w:pBdr>
-          <w:bottom w:val="single" w:sz="6" w:space="2" w:color="B8C4CE"/>
+          <w:bottom w:val="single" w:sz="6" w:space="2" w:color="A7A7A7"/>
         </w:pBdr>
       </w:pPr>
       <w:r>
         <w:rPr>
           <w:rFonts w:ascii="Arial" w:hAnsi="Arial" w:eastAsia="Arial"/>
           <w:b/>
-          <w:color w:val="0B5CAD"/>
-          <w:sz w:val="19"/>
+          <w:color w:val="111111"/>
+          <w:sz w:val="22"/>
         </w:rPr>
         <w:t>SKILLS</w:t>
       </w:r>
     </w:p>
     <w:p>
       <w:pPr>
-        <w:spacing w:after="10" w:line="240" w:lineRule="auto"/>
+        <w:spacing w:after="24" w:line="254" w:lineRule="auto"/>
       </w:pPr>
       <w:r>
         <w:rPr>
           <w:rFonts w:ascii="Arial" w:hAnsi="Arial" w:eastAsia="Arial"/>
           <w:b/>
-          <w:color w:val="1F2328"/>
-          <w:sz w:val="18"/>
+          <w:color w:val="111111"/>
+          <w:sz w:val="20"/>
         </w:rPr>
         <w:t xml:space="preserve">Web &amp; Software: </w:t>
       </w:r>
@@ -165,22 +165,22 @@
         <w:rPr>
           <w:rFonts w:ascii="Arial" w:hAnsi="Arial" w:eastAsia="Arial"/>
           <w:b w:val="0"/>
-          <w:color w:val="1F2328"/>
-          <w:sz w:val="18"/>
+          <w:color w:val="111111"/>
+          <w:sz w:val="20"/>
         </w:rPr>
         <w:t>TypeScript, JavaScript, React, Next.js, Node.js, Python, PHP/Laravel, Flutter, REST APIs, SQL, Firebase, Supabase</w:t>
       </w:r>
     </w:p>
     <w:p>
       <w:pPr>
-        <w:spacing w:after="10" w:line="240" w:lineRule="auto"/>
+        <w:spacing w:after="24" w:line="254" w:lineRule="auto"/>
       </w:pPr>
       <w:r>
         <w:rPr>
           <w:rFonts w:ascii="Arial" w:hAnsi="Arial" w:eastAsia="Arial"/>
           <w:b/>
-          <w:color w:val="1F2328"/>
-          <w:sz w:val="18"/>
+          <w:color w:val="111111"/>
+          <w:sz w:val="20"/>
         </w:rPr>
         <w:t xml:space="preserve">Automation &amp; AI: </w:t>
       </w:r>
@@ -188,22 +188,22 @@
         <w:rPr>
           <w:rFonts w:ascii="Arial" w:hAnsi="Arial" w:eastAsia="Arial"/>
           <w:b w:val="0"/>
-          <w:color w:val="1F2328"/>
-          <w:sz w:val="18"/>
+          <w:color w:val="111111"/>
+          <w:sz w:val="20"/>
         </w:rPr>
         <w:t>n8n, OpenClaw, Claude Code, Codex, webhooks, Playwright, Selenium, API integration, workflow validation</w:t>
       </w:r>
     </w:p>
     <w:p>
       <w:pPr>
-        <w:spacing w:after="10" w:line="240" w:lineRule="auto"/>
+        <w:spacing w:after="24" w:line="254" w:lineRule="auto"/>
       </w:pPr>
       <w:r>
         <w:rPr>
           <w:rFonts w:ascii="Arial" w:hAnsi="Arial" w:eastAsia="Arial"/>
           <w:b/>
-          <w:color w:val="1F2328"/>
-          <w:sz w:val="18"/>
+          <w:color w:val="111111"/>
+          <w:sz w:val="20"/>
         </w:rPr>
         <w:t xml:space="preserve">Data, ML &amp; Cloud: </w:t>
       </w:r>
@@ -211,8 +211,8 @@
         <w:rPr>
           <w:rFonts w:ascii="Arial" w:hAnsi="Arial" w:eastAsia="Arial"/>
           <w:b w:val="0"/>
-          <w:color w:val="1F2328"/>
-          <w:sz w:val="18"/>
+          <w:color w:val="111111"/>
+          <w:sz w:val="20"/>
         </w:rPr>
         <w:t>AWS, Kaggle, CVAT, YOLOv8-seg, YOLOv26-seg, computer vision, ABSA, XLM-RoBERTa, BERTopic, pandas</w:t>
       </w:r>
@@ -222,15 +222,15 @@
         <w:pStyle w:val="ResumeSection"/>
         <w:keepNext/>
         <w:pBdr>
-          <w:bottom w:val="single" w:sz="6" w:space="2" w:color="B8C4CE"/>
+          <w:bottom w:val="single" w:sz="6" w:space="2" w:color="A7A7A7"/>
         </w:pBdr>
       </w:pPr>
       <w:r>
         <w:rPr>
           <w:rFonts w:ascii="Arial" w:hAnsi="Arial" w:eastAsia="Arial"/>
           <w:b/>
-          <w:color w:val="0B5CAD"/>
-          <w:sz w:val="19"/>
+          <w:color w:val="111111"/>
+          <w:sz w:val="22"/>
         </w:rPr>
         <w:t>EXPERIENCE</w:t>
       </w:r>
@@ -244,10 +244,10 @@
         <w:rPr>
           <w:rFonts w:ascii="Arial" w:hAnsi="Arial" w:eastAsia="Arial"/>
           <w:b/>
-          <w:color w:val="111827"/>
-          <w:sz w:val="18"/>
+          <w:color w:val="111111"/>
+          <w:sz w:val="20"/>
         </w:rPr>
-        <w:t>Freelance Full-Stack Developer &amp; Automation Builder | Self-Employed · Remote | 2024–Present</w:t>
+        <w:t>Freelance Full-Stack Developer &amp; Automation Builder | Self-Employed - Remote | 2023-Present</w:t>
       </w:r>
     </w:p>
     <w:p>
@@ -259,8 +259,8 @@
         <w:rPr>
           <w:rFonts w:ascii="Arial" w:hAnsi="Arial" w:eastAsia="Arial"/>
           <w:b w:val="0"/>
-          <w:color w:val="1F2328"/>
-          <w:sz w:val="18"/>
+          <w:color w:val="111111"/>
+          <w:sz w:val="20"/>
         </w:rPr>
         <w:t>Built and deployed mobile-friendly websites, booking and e-commerce experiences, dashboards, internal tools, APIs, authentication, and database-backed workflows across React, Next.js, Node.js, Python, PHP, Firebase, and Supabase.</w:t>
       </w:r>
@@ -274,8 +274,8 @@
         <w:rPr>
           <w:rFonts w:ascii="Arial" w:hAnsi="Arial" w:eastAsia="Arial"/>
           <w:b w:val="0"/>
-          <w:color w:val="1F2328"/>
-          <w:sz w:val="18"/>
+          <w:color w:val="111111"/>
+          <w:sz w:val="20"/>
         </w:rPr>
         <w:t>Automated public-data research and repetitive operations with Python, browser automation, n8n, OpenClaw, and AI APIs, including validation, deduplication, retries, and human-review checkpoints.</w:t>
       </w:r>
@@ -289,10 +289,10 @@
         <w:rPr>
           <w:rFonts w:ascii="Arial" w:hAnsi="Arial" w:eastAsia="Arial"/>
           <w:b/>
-          <w:color w:val="111827"/>
-          <w:sz w:val="18"/>
+          <w:color w:val="111111"/>
+          <w:sz w:val="20"/>
         </w:rPr>
-        <w:t>AI Automation &amp; Lead Data Specialist | Grow Business UK · Remote | 2026</w:t>
+        <w:t>AI Automation &amp; Lead Data Specialist | Grow Business UK - Remote | 2026</w:t>
       </w:r>
     </w:p>
     <w:p>
@@ -304,8 +304,8 @@
         <w:rPr>
           <w:rFonts w:ascii="Arial" w:hAnsi="Arial" w:eastAsia="Arial"/>
           <w:b w:val="0"/>
-          <w:color w:val="1F2328"/>
-          <w:sz w:val="18"/>
+          <w:color w:val="111111"/>
+          <w:sz w:val="20"/>
         </w:rPr>
         <w:t>Processed and enriched 9,000+ seller and business records; resolved blocked sources, missing fields, proxy issues, and data-quality failures while turning changing requirements into repeatable documented workflows.</w:t>
       </w:r>
@@ -319,10 +319,10 @@
         <w:rPr>
           <w:rFonts w:ascii="Arial" w:hAnsi="Arial" w:eastAsia="Arial"/>
           <w:b/>
-          <w:color w:val="111827"/>
-          <w:sz w:val="18"/>
+          <w:color w:val="111111"/>
+          <w:sz w:val="20"/>
         </w:rPr>
-        <w:t>Lead Generation &amp; Web Scraping VA | FullKalendar / Fullkalender.no · Remote | 2026</w:t>
+        <w:t>Lead Generation &amp; Web Scraping VA | FullKalendar / Fullkalender.no - Remote | 2026</w:t>
       </w:r>
     </w:p>
     <w:p>
@@ -334,8 +334,8 @@
         <w:rPr>
           <w:rFonts w:ascii="Arial" w:hAnsi="Arial" w:eastAsia="Arial"/>
           <w:b w:val="0"/>
-          <w:color w:val="1F2328"/>
-          <w:sz w:val="18"/>
+          <w:color w:val="111111"/>
+          <w:sz w:val="20"/>
         </w:rPr>
         <w:t>Collected and standardized leads from Norwegian directories and Google Maps, tracked source and status fields, removed duplicates, and delivered structured recurring client datasets.</w:t>
       </w:r>
@@ -345,29 +345,29 @@
         <w:pStyle w:val="ResumeSection"/>
         <w:keepNext/>
         <w:pBdr>
-          <w:bottom w:val="single" w:sz="6" w:space="2" w:color="B8C4CE"/>
+          <w:bottom w:val="single" w:sz="6" w:space="2" w:color="A7A7A7"/>
         </w:pBdr>
       </w:pPr>
       <w:r>
         <w:rPr>
           <w:rFonts w:ascii="Arial" w:hAnsi="Arial" w:eastAsia="Arial"/>
           <w:b/>
-          <w:color w:val="0B5CAD"/>
-          <w:sz w:val="19"/>
+          <w:color w:val="111111"/>
+          <w:sz w:val="22"/>
         </w:rPr>
         <w:t>SELECTED PROJECTS</w:t>
       </w:r>
     </w:p>
     <w:p>
       <w:pPr>
-        <w:spacing w:after="12" w:line="240" w:lineRule="auto"/>
+        <w:spacing w:after="24" w:line="254" w:lineRule="auto"/>
       </w:pPr>
       <w:r>
         <w:rPr>
           <w:rFonts w:ascii="Arial" w:hAnsi="Arial" w:eastAsia="Arial"/>
           <w:b/>
-          <w:color w:val="1F2328"/>
-          <w:sz w:val="18"/>
+          <w:color w:val="111111"/>
+          <w:sz w:val="20"/>
         </w:rPr>
         <w:t xml:space="preserve">RiceGuardAI: </w:t>
       </w:r>
@@ -375,22 +375,22 @@
         <w:rPr>
           <w:rFonts w:ascii="Arial" w:hAnsi="Arial" w:eastAsia="Arial"/>
           <w:b w:val="0"/>
-          <w:color w:val="1F2328"/>
-          <w:sz w:val="18"/>
+          <w:color w:val="111111"/>
+          <w:sz w:val="20"/>
         </w:rPr>
         <w:t>Drone-assisted rice disease segmentation workflow using AWS, Kaggle, CVAT, and YOLO; handled dataset validation, annotation refinement, evaluation, and application-facing results.</w:t>
       </w:r>
     </w:p>
     <w:p>
       <w:pPr>
-        <w:spacing w:after="12" w:line="240" w:lineRule="auto"/>
+        <w:spacing w:after="24" w:line="254" w:lineRule="auto"/>
       </w:pPr>
       <w:r>
         <w:rPr>
           <w:rFonts w:ascii="Arial" w:hAnsi="Arial" w:eastAsia="Arial"/>
           <w:b/>
-          <w:color w:val="1F2328"/>
-          <w:sz w:val="18"/>
+          <w:color w:val="111111"/>
+          <w:sz w:val="20"/>
         </w:rPr>
         <w:t xml:space="preserve">AI Outreach Bot v2: </w:t>
       </w:r>
@@ -398,22 +398,22 @@
         <w:rPr>
           <w:rFonts w:ascii="Arial" w:hAnsi="Arial" w:eastAsia="Arial"/>
           <w:b w:val="0"/>
-          <w:color w:val="1F2328"/>
-          <w:sz w:val="18"/>
+          <w:color w:val="111111"/>
+          <w:sz w:val="20"/>
         </w:rPr>
         <w:t>Built an AWS-hosted, 11-node n8n workflow that generates outreach, previews messages in Telegram, and keeps SMS sending behind a deliberate gate.</w:t>
       </w:r>
     </w:p>
     <w:p>
       <w:pPr>
-        <w:spacing w:after="12" w:line="240" w:lineRule="auto"/>
+        <w:spacing w:after="24" w:line="254" w:lineRule="auto"/>
       </w:pPr>
       <w:r>
         <w:rPr>
           <w:rFonts w:ascii="Arial" w:hAnsi="Arial" w:eastAsia="Arial"/>
           <w:b/>
-          <w:color w:val="1F2328"/>
-          <w:sz w:val="18"/>
+          <w:color w:val="111111"/>
+          <w:sz w:val="20"/>
         </w:rPr>
         <w:t xml:space="preserve">Cagayan Review Intelligence: </w:t>
       </w:r>
@@ -421,22 +421,22 @@
         <w:rPr>
           <w:rFonts w:ascii="Arial" w:hAnsi="Arial" w:eastAsia="Arial"/>
           <w:b w:val="0"/>
-          <w:color w:val="1F2328"/>
-          <w:sz w:val="18"/>
+          <w:color w:val="111111"/>
+          <w:sz w:val="20"/>
         </w:rPr>
         <w:t>Built a multilingual ABSA pipeline; V8 reached 82.08% accuracy and 81.79% macro-F1 on a fresh, balanced 240-item holdout.</w:t>
       </w:r>
     </w:p>
     <w:p>
       <w:pPr>
-        <w:spacing w:after="12" w:line="240" w:lineRule="auto"/>
+        <w:spacing w:after="24" w:line="254" w:lineRule="auto"/>
       </w:pPr>
       <w:r>
         <w:rPr>
           <w:rFonts w:ascii="Arial" w:hAnsi="Arial" w:eastAsia="Arial"/>
           <w:b/>
-          <w:color w:val="1F2328"/>
-          <w:sz w:val="18"/>
+          <w:color w:val="111111"/>
+          <w:sz w:val="20"/>
         </w:rPr>
         <w:t xml:space="preserve">SkyGlass &amp; Drones and Gadgets PH: </w:t>
       </w:r>
@@ -444,8 +444,8 @@
         <w:rPr>
           <w:rFonts w:ascii="Arial" w:hAnsi="Arial" w:eastAsia="Arial"/>
           <w:b w:val="0"/>
-          <w:color w:val="1F2328"/>
-          <w:sz w:val="18"/>
+          <w:color w:val="111111"/>
+          <w:sz w:val="20"/>
         </w:rPr>
         <w:t>Designed and deployed responsive business websites that turn complex offerings into clear discovery, inquiry, and product journeys.</w:t>
       </w:r>
@@ -455,50 +455,64 @@
         <w:pStyle w:val="ResumeSection"/>
         <w:keepNext/>
         <w:pBdr>
-          <w:bottom w:val="single" w:sz="6" w:space="2" w:color="B8C4CE"/>
+          <w:bottom w:val="single" w:sz="6" w:space="2" w:color="A7A7A7"/>
         </w:pBdr>
       </w:pPr>
       <w:r>
         <w:rPr>
           <w:rFonts w:ascii="Arial" w:hAnsi="Arial" w:eastAsia="Arial"/>
           <w:b/>
-          <w:color w:val="0B5CAD"/>
-          <w:sz w:val="19"/>
+          <w:color w:val="111111"/>
+          <w:sz w:val="22"/>
         </w:rPr>
         <w:t>EDUCATION &amp; ACHIEVEMENTS</w:t>
       </w:r>
     </w:p>
     <w:p>
       <w:pPr>
-        <w:spacing w:after="10" w:line="240" w:lineRule="auto"/>
+        <w:spacing w:after="24" w:line="259" w:lineRule="auto"/>
       </w:pPr>
       <w:r>
         <w:rPr>
           <w:rFonts w:ascii="Arial" w:hAnsi="Arial" w:eastAsia="Arial"/>
           <w:b w:val="0"/>
-          <w:color w:val="1F2328"/>
-          <w:sz w:val="19"/>
+          <w:color w:val="111111"/>
+          <w:sz w:val="21"/>
         </w:rPr>
         <w:t>Bachelor of Science in Computer Science | Isabela State University, Cabagan Campus | Expected 2027</w:t>
       </w:r>
     </w:p>
     <w:p>
       <w:pPr>
-        <w:spacing w:after="0" w:line="240" w:lineRule="auto"/>
+        <w:spacing w:after="24" w:line="259" w:lineRule="auto"/>
       </w:pPr>
       <w:r>
         <w:rPr>
           <w:rFonts w:ascii="Arial" w:hAnsi="Arial" w:eastAsia="Arial"/>
           <w:b w:val="0"/>
-          <w:color w:val="1F2328"/>
-          <w:sz w:val="19"/>
+          <w:color w:val="111111"/>
+          <w:sz w:val="21"/>
         </w:rPr>
-        <w:t>Data Analytics Challenge Champion, 15th ICT Roadshow (2025) | Introduction to Modern AI, Cisco Networking Academy / DICT–ITU (2026) | Algorithm and Program Design, Huawei Talent (2025) | RoboFusion Line Follower Competition Participant (2025)</w:t>
+        <w:t>Data Analytics Challenge Champion, 15th ICT Roadshow (2025) | RoboFusion Champion, iScene RoboFusion (2025) | Cyber Defense Exercise Qualifiers, TRON event documentation</w:t>
+      </w:r>
+    </w:p>
+    <w:p>
+      <w:pPr>
+        <w:spacing w:after="0" w:line="259" w:lineRule="auto"/>
+      </w:pPr>
+      <w:r>
+        <w:rPr>
+          <w:rFonts w:ascii="Arial" w:hAnsi="Arial" w:eastAsia="Arial"/>
+          <w:b w:val="0"/>
+          <w:color w:val="111111"/>
+          <w:sz w:val="21"/>
+        </w:rPr>
+        <w:t>Introduction to Modern AI, Cisco Networking Academy / DICT-ITU (2026) | Algorithm and Program Design, Huawei Talent (2025)</w:t>
       </w:r>
     </w:p>
     <w:sectPr>
       <w:pgSz w:w="12240" w:h="15840"/>
-      <w:pgMar w:top="691" w:right="893" w:bottom="648" w:left="893" w:header="720" w:footer="720" w:gutter="0"/>
+      <w:pgMar w:top="662" w:right="893" w:bottom="605" w:left="893" w:header="720" w:footer="720" w:gutter="0"/>
       <w:cols w:space="720"/>
       <w:docGrid w:linePitch="360"/>
     </w:sectPr>
@@ -874,7 +888,7 @@
     </w:pPr>
     <w:rPr>
       <w:rFonts w:ascii="Arial" w:hAnsi="Arial" w:eastAsia="Arial"/>
-      <w:sz w:val="19"/>
+      <w:sz w:val="21"/>
     </w:rPr>
   </w:style>
   <w:style w:type="paragraph" w:styleId="Header">
@@ -12562,19 +12576,19 @@
   <w:style w:type="paragraph" w:customStyle="1" w:styleId="ResumeSection">
     <w:name w:val="Resume Section"/>
     <w:pPr>
-      <w:spacing w:before="90" w:after="50"/>
+      <w:spacing w:before="140" w:after="76"/>
     </w:pPr>
   </w:style>
   <w:style w:type="paragraph" w:customStyle="1" w:styleId="ResumeRole">
     <w:name w:val="Resume Role"/>
     <w:pPr>
-      <w:spacing w:before="30" w:after="10"/>
+      <w:spacing w:before="44" w:after="24"/>
     </w:pPr>
   </w:style>
   <w:style w:type="paragraph" w:customStyle="1" w:styleId="ResumeBullet">
     <w:name w:val="Resume Bullet"/>
     <w:pPr>
-      <w:spacing w:after="14" w:line="240" w:lineRule="auto"/>
+      <w:spacing w:after="36" w:line="254" w:lineRule="auto"/>
       <w:ind w:left="230" w:hanging="173"/>
     </w:pPr>
   </w:style>

</xml_diff>